<commit_message>
Document individual contributions in team labs 2, 5 and 6
</commit_message>
<xml_diff>
--- a/lab02_annotation/report.docx
+++ b/lab02_annotation/report.docx
@@ -296,7 +296,7 @@
       <w:r>
         <w:fldChar w:fldCharType="separate"/>
       </w:r>
-      <w:hyperlink w:anchor="_Toc239790086" w:history="1">
+      <w:hyperlink w:anchor="_Toc239791217" w:history="1">
         <w:r>
           <w:rPr>
             <w:rStyle w:val="aff8"/>
@@ -324,7 +324,7 @@
             <w:noProof/>
             <w:webHidden/>
           </w:rPr>
-          <w:instrText xml:space="preserve"> PAGEREF _Toc239790086 \h </w:instrText>
+          <w:instrText xml:space="preserve"> PAGEREF _Toc239791217 \h </w:instrText>
         </w:r>
         <w:r>
           <w:rPr>
@@ -369,7 +369,7 @@
           <w:lang w:val="ru-RU" w:eastAsia="ru-RU"/>
         </w:rPr>
       </w:pPr>
-      <w:hyperlink w:anchor="_Toc239790087" w:history="1">
+      <w:hyperlink w:anchor="_Toc239791218" w:history="1">
         <w:r>
           <w:rPr>
             <w:rStyle w:val="aff8"/>
@@ -397,7 +397,7 @@
             <w:noProof/>
             <w:webHidden/>
           </w:rPr>
-          <w:instrText xml:space="preserve"> PAGEREF _Toc239790087 \h </w:instrText>
+          <w:instrText xml:space="preserve"> PAGEREF _Toc239791218 \h </w:instrText>
         </w:r>
         <w:r>
           <w:rPr>
@@ -442,7 +442,7 @@
           <w:lang w:val="ru-RU" w:eastAsia="ru-RU"/>
         </w:rPr>
       </w:pPr>
-      <w:hyperlink w:anchor="_Toc239790088" w:history="1">
+      <w:hyperlink w:anchor="_Toc239791219" w:history="1">
         <w:r>
           <w:rPr>
             <w:rStyle w:val="aff8"/>
@@ -470,7 +470,7 @@
             <w:noProof/>
             <w:webHidden/>
           </w:rPr>
-          <w:instrText xml:space="preserve"> PAGEREF _Toc239790088 \h </w:instrText>
+          <w:instrText xml:space="preserve"> PAGEREF _Toc239791219 \h </w:instrText>
         </w:r>
         <w:r>
           <w:rPr>
@@ -515,7 +515,7 @@
           <w:lang w:val="ru-RU" w:eastAsia="ru-RU"/>
         </w:rPr>
       </w:pPr>
-      <w:hyperlink w:anchor="_Toc239790089" w:history="1">
+      <w:hyperlink w:anchor="_Toc239791220" w:history="1">
         <w:r>
           <w:rPr>
             <w:rStyle w:val="aff8"/>
@@ -543,7 +543,7 @@
             <w:noProof/>
             <w:webHidden/>
           </w:rPr>
-          <w:instrText xml:space="preserve"> PAGEREF _Toc239790089 \h </w:instrText>
+          <w:instrText xml:space="preserve"> PAGEREF _Toc239791220 \h </w:instrText>
         </w:r>
         <w:r>
           <w:rPr>
@@ -588,7 +588,7 @@
           <w:lang w:val="ru-RU" w:eastAsia="ru-RU"/>
         </w:rPr>
       </w:pPr>
-      <w:hyperlink w:anchor="_Toc239790090" w:history="1">
+      <w:hyperlink w:anchor="_Toc239791221" w:history="1">
         <w:r>
           <w:rPr>
             <w:rStyle w:val="aff8"/>
@@ -616,7 +616,7 @@
             <w:noProof/>
             <w:webHidden/>
           </w:rPr>
-          <w:instrText xml:space="preserve"> PAGEREF _Toc239790090 \h </w:instrText>
+          <w:instrText xml:space="preserve"> PAGEREF _Toc239791221 \h </w:instrText>
         </w:r>
         <w:r>
           <w:rPr>
@@ -661,7 +661,7 @@
           <w:lang w:val="ru-RU" w:eastAsia="ru-RU"/>
         </w:rPr>
       </w:pPr>
-      <w:hyperlink w:anchor="_Toc239790091" w:history="1">
+      <w:hyperlink w:anchor="_Toc239791222" w:history="1">
         <w:r>
           <w:rPr>
             <w:rStyle w:val="aff8"/>
@@ -689,7 +689,7 @@
             <w:noProof/>
             <w:webHidden/>
           </w:rPr>
-          <w:instrText xml:space="preserve"> PAGEREF _Toc239790091 \h </w:instrText>
+          <w:instrText xml:space="preserve"> PAGEREF _Toc239791222 \h </w:instrText>
         </w:r>
         <w:r>
           <w:rPr>
@@ -722,7 +722,7 @@
     </w:p>
     <w:p>
       <w:pPr>
-        <w:pStyle w:val="14"/>
+        <w:pStyle w:val="2c"/>
         <w:tabs>
           <w:tab w:val="right" w:leader="dot" w:pos="9345"/>
         </w:tabs>
@@ -734,14 +734,14 @@
           <w:lang w:val="ru-RU" w:eastAsia="ru-RU"/>
         </w:rPr>
       </w:pPr>
-      <w:hyperlink w:anchor="_Toc239790092" w:history="1">
+      <w:hyperlink w:anchor="_Toc239791223" w:history="1">
         <w:r>
           <w:rPr>
             <w:rStyle w:val="aff8"/>
             <w:rFonts w:eastAsiaTheme="majorEastAsia"/>
             <w:noProof/>
           </w:rPr>
-          <w:t>ЗАКЛЮЧЕНИЕ</w:t>
+          <w:t>1.5 Вклад участников</w:t>
         </w:r>
         <w:r>
           <w:rPr>
@@ -762,7 +762,7 @@
             <w:noProof/>
             <w:webHidden/>
           </w:rPr>
-          <w:instrText xml:space="preserve"> PAGEREF _Toc239790092 \h </w:instrText>
+          <w:instrText xml:space="preserve"> PAGEREF _Toc239791223 \h </w:instrText>
         </w:r>
         <w:r>
           <w:rPr>
@@ -807,14 +807,14 @@
           <w:lang w:val="ru-RU" w:eastAsia="ru-RU"/>
         </w:rPr>
       </w:pPr>
-      <w:hyperlink w:anchor="_Toc239790093" w:history="1">
+      <w:hyperlink w:anchor="_Toc239791224" w:history="1">
         <w:r>
           <w:rPr>
             <w:rStyle w:val="aff8"/>
             <w:rFonts w:eastAsiaTheme="majorEastAsia"/>
             <w:noProof/>
           </w:rPr>
-          <w:t>СПИСОК ИСПОЛЬЗОВАННЫХ ИСТОЧНИКОВ</w:t>
+          <w:t>ЗАКЛЮЧЕНИЕ</w:t>
         </w:r>
         <w:r>
           <w:rPr>
@@ -835,7 +835,7 @@
             <w:noProof/>
             <w:webHidden/>
           </w:rPr>
-          <w:instrText xml:space="preserve"> PAGEREF _Toc239790093 \h </w:instrText>
+          <w:instrText xml:space="preserve"> PAGEREF _Toc239791224 \h </w:instrText>
         </w:r>
         <w:r>
           <w:rPr>
@@ -868,6 +868,79 @@
     </w:p>
     <w:p>
       <w:pPr>
+        <w:pStyle w:val="14"/>
+        <w:tabs>
+          <w:tab w:val="right" w:leader="dot" w:pos="9345"/>
+        </w:tabs>
+        <w:rPr>
+          <w:rFonts w:asciiTheme="minorHAnsi" w:eastAsiaTheme="minorEastAsia" w:hAnsiTheme="minorHAnsi"/>
+          <w:noProof/>
+          <w:color w:val="auto"/>
+          <w:sz w:val="22"/>
+          <w:lang w:val="ru-RU" w:eastAsia="ru-RU"/>
+        </w:rPr>
+      </w:pPr>
+      <w:hyperlink w:anchor="_Toc239791225" w:history="1">
+        <w:r>
+          <w:rPr>
+            <w:rStyle w:val="aff8"/>
+            <w:rFonts w:eastAsiaTheme="majorEastAsia"/>
+            <w:noProof/>
+          </w:rPr>
+          <w:t>СПИСОК ИСПОЛЬЗОВАННЫХ ИСТОЧНИКОВ</w:t>
+        </w:r>
+        <w:r>
+          <w:rPr>
+            <w:noProof/>
+            <w:webHidden/>
+          </w:rPr>
+          <w:tab/>
+        </w:r>
+        <w:r>
+          <w:rPr>
+            <w:noProof/>
+            <w:webHidden/>
+          </w:rPr>
+          <w:fldChar w:fldCharType="begin"/>
+        </w:r>
+        <w:r>
+          <w:rPr>
+            <w:noProof/>
+            <w:webHidden/>
+          </w:rPr>
+          <w:instrText xml:space="preserve"> PAGEREF _Toc239791225 \h </w:instrText>
+        </w:r>
+        <w:r>
+          <w:rPr>
+            <w:noProof/>
+            <w:webHidden/>
+          </w:rPr>
+        </w:r>
+        <w:r>
+          <w:rPr>
+            <w:noProof/>
+            <w:webHidden/>
+          </w:rPr>
+          <w:fldChar w:fldCharType="separate"/>
+        </w:r>
+        <w:r>
+          <w:rPr>
+            <w:noProof/>
+            <w:webHidden/>
+          </w:rPr>
+          <w:t>9</w:t>
+        </w:r>
+        <w:r>
+          <w:rPr>
+            <w:noProof/>
+            <w:webHidden/>
+          </w:rPr>
+          <w:fldChar w:fldCharType="end"/>
+        </w:r>
+      </w:hyperlink>
+    </w:p>
+    <w:p>
+      <w:pPr>
         <w:ind w:firstLine="0"/>
       </w:pPr>
       <w:r>
@@ -883,7 +956,7 @@
         <w:ind w:firstLine="0"/>
         <w:jc w:val="center"/>
       </w:pPr>
-      <w:bookmarkStart w:id="1" w:name="_Toc239790086"/>
+      <w:bookmarkStart w:id="1" w:name="_Toc239791217"/>
       <w:r>
         <w:lastRenderedPageBreak/>
         <w:t>ВВЕДЕНИЕ</w:t>
@@ -920,7 +993,7 @@
         <w:spacing w:after="240"/>
         <w:jc w:val="left"/>
       </w:pPr>
-      <w:bookmarkStart w:id="2" w:name="_Toc239790087"/>
+      <w:bookmarkStart w:id="2" w:name="_Toc239791218"/>
       <w:r>
         <w:lastRenderedPageBreak/>
         <w:t>1 Выполнение работы</w:t>
@@ -934,7 +1007,7 @@
         <w:spacing w:before="240" w:after="240"/>
         <w:jc w:val="left"/>
       </w:pPr>
-      <w:bookmarkStart w:id="3" w:name="_Toc239790088"/>
+      <w:bookmarkStart w:id="3" w:name="_Toc239791219"/>
       <w:r>
         <w:t>1.1 Первичная разметка</w:t>
       </w:r>
@@ -1459,7 +1532,7 @@
         <w:spacing w:before="240" w:after="240"/>
         <w:jc w:val="left"/>
       </w:pPr>
-      <w:bookmarkStart w:id="4" w:name="_Toc239790089"/>
+      <w:bookmarkStart w:id="4" w:name="_Toc239791220"/>
       <w:r>
         <w:t>1.2 Выбор разногласий и общая инструкция</w:t>
       </w:r>
@@ -1509,7 +1582,7 @@
         <w:spacing w:before="240" w:after="240"/>
         <w:jc w:val="left"/>
       </w:pPr>
-      <w:bookmarkStart w:id="5" w:name="_Toc239790090"/>
+      <w:bookmarkStart w:id="5" w:name="_Toc239791221"/>
       <w:r>
         <w:t>1.3 Три спорных примера</w:t>
       </w:r>
@@ -1553,7 +1626,7 @@
         <w:spacing w:before="240" w:after="240"/>
         <w:jc w:val="left"/>
       </w:pPr>
-      <w:bookmarkStart w:id="6" w:name="_Toc239790091"/>
+      <w:bookmarkStart w:id="6" w:name="_Toc239791222"/>
       <w:r>
         <w:t>1.4 Повторный этап и ограничения</w:t>
       </w:r>
@@ -1580,29 +1653,46 @@
     </w:p>
     <w:p>
       <w:pPr>
-        <w:pStyle w:val="1"/>
+        <w:pStyle w:val="21"/>
         <w:keepNext/>
-        <w:pageBreakBefore/>
-        <w:spacing w:after="240"/>
-        <w:ind w:firstLine="0"/>
-        <w:jc w:val="center"/>
+        <w:spacing w:before="240" w:after="240"/>
+        <w:jc w:val="left"/>
       </w:pPr>
-      <w:bookmarkStart w:id="7" w:name="_Toc239790092"/>
+      <w:bookmarkStart w:id="7" w:name="_Toc239791223"/>
       <w:r>
         <w:lastRenderedPageBreak/>
-        <w:t>ЗАКЛЮЧЕНИЕ</w:t>
+        <w:t>1.5 Вклад участников</w:t>
       </w:r>
       <w:bookmarkEnd w:id="7"/>
     </w:p>
     <w:p>
+      <w:pPr>
+        <w:keepLines/>
+      </w:pPr>
       <w:r>
-        <w:t>Инструкция устраняет расхождения, вы</w:t>
+        <w:t>Дущенко Даниил Александров</w:t>
       </w:r>
       <w:r>
-        <w:t>званные разными критериями, обработкой рекламы, сроков и цитат. Недостаток реального контекста полностью устранить нельзя: его следует явно кодировать и анализировать. Целевая переменная возникает из согласованной исследовательской процедуры. Для воспроизв</w:t>
+        <w:t>ич подготовил корпус из 90 сообщений и идентификаторы записей, организовал получение первичных и повторных модельных разметок, объединил файлы ответов и реализовал воспроизводимый выбор 30 спорных текстов.</w:t>
+      </w:r>
+    </w:p>
+    <w:p>
+      <w:pPr>
+        <w:keepLines/>
+      </w:pPr>
+      <w:r>
+        <w:t>Коваленко Евгений Юрьевич систематизировал причины</w:t>
       </w:r>
       <w:r>
-        <w:t>одимости сохранены шесть файлов индивидуальных ответов, объединённая таблица, список спорных случаев, инструкция и расчёт метрик. Повторный запуск evaluate.py восстанавливает все коэффициенты из исходных меток.</w:t>
+        <w:t xml:space="preserve"> разногласий, подготовил общую инструкцию и примеры пограничных случаев, выполнил расчёт и проверку коэффициентов Cohen’s kappa и Fleiss’ kappa, сопоставил результаты до и после уточнения инструкции.</w:t>
+      </w:r>
+    </w:p>
+    <w:p>
+      <w:r>
+        <w:t xml:space="preserve">Совместно мы сформулировали выводы и подготовили отчёт. </w:t>
+      </w:r>
+      <w:r>
+        <w:t>Обозначения A/B/C относятся к трём модельным разметчикам, а не к авторам отчёта; их исходные ответы при анализе не исправлялись.</w:t>
       </w:r>
     </w:p>
     <w:p>
@@ -1614,27 +1704,51 @@
         <w:ind w:firstLine="0"/>
         <w:jc w:val="center"/>
       </w:pPr>
-      <w:bookmarkStart w:id="8" w:name="_Toc239790093"/>
+      <w:bookmarkStart w:id="8" w:name="_Toc239791224"/>
       <w:r>
         <w:lastRenderedPageBreak/>
-        <w:t>СПИСОК ИСПОЛЬЗОВАННЫХ ИСТОЧНИКОВ</w:t>
+        <w:t>ЗАКЛЮЧЕНИЕ</w:t>
       </w:r>
       <w:bookmarkEnd w:id="8"/>
     </w:p>
     <w:p>
       <w:r>
-        <w:t>[1] scikit-l</w:t>
+        <w:t>Инструкция устраняет расхождения, вызванные разными критериями, обработкой рекламы, сроков и цитат. Недостаток реаль</w:t>
       </w:r>
       <w:r>
-        <w:t>earn. cohen_kappa_score. URL: https://scikit-learn.org/stable/modules/generated/sklearn.metrics.cohen_kappa_score.html (дата обращения: 08.09.2026).</w:t>
+        <w:t>ного контекста полностью устранить нельзя: его следует явно кодировать и анализировать. Целевая переменная возникает из согласованной исследовательской процедуры. Для воспроизводимости сохранены шесть файлов индивидуальных ответов, объединённая таблица, сп</w:t>
+      </w:r>
+      <w:r>
+        <w:t>исок спорных случаев, инструкция и расчёт метрик. Повторный запуск evaluate.py восстанавливает все коэффициенты из исходных меток.</w:t>
+      </w:r>
+    </w:p>
+    <w:p>
+      <w:pPr>
+        <w:pStyle w:val="1"/>
+        <w:keepNext/>
+        <w:pageBreakBefore/>
+        <w:spacing w:after="240"/>
+        <w:ind w:firstLine="0"/>
+        <w:jc w:val="center"/>
+      </w:pPr>
+      <w:bookmarkStart w:id="9" w:name="_Toc239791225"/>
+      <w:r>
+        <w:lastRenderedPageBreak/>
+        <w:t>СПИСОК ИСПОЛЬЗОВАННЫХ ИСТОЧНИКОВ</w:t>
+      </w:r>
+      <w:bookmarkEnd w:id="9"/>
+    </w:p>
+    <w:p>
+      <w:r>
+        <w:t>[1] scikit-learn. cohen_kappa_score. URL: https://scikit-learn.org/stable/modules/generated/</w:t>
+      </w:r>
+      <w:r>
+        <w:t>sklearn.metrics.cohen_kappa_score.html (дата обращения: 08.09.2026).</w:t>
       </w:r>
     </w:p>
     <w:p>
       <w:r>
-        <w:t>[2] statsmodels. fleiss_kappa. URL: https://www.statsmodels.org/stable/generated/statsmodels.stats.inter_ra</w:t>
-      </w:r>
-      <w:r>
-        <w:t>ter.fleiss_kappa.html (дата обращения: 08.09.2026).</w:t>
+        <w:t>[2] statsmodels. fleiss_kappa. URL: https://www.statsmodels.org/stable/generated/statsmodels.stats.inter_rater.fleiss_kappa.html (дата обращения: 08.09.2026).</w:t>
       </w:r>
     </w:p>
     <w:sectPr>
@@ -13694,7 +13808,7 @@
 </file>
 
 <file path=customXml/itemProps1.xml><?xml version="1.0" encoding="utf-8"?>
-<ds:datastoreItem xmlns:ds="http://schemas.openxmlformats.org/officeDocument/2006/customXml" ds:itemID="{8E0DB6A8-413B-497B-A8FF-3F5B88184534}">
+<ds:datastoreItem xmlns:ds="http://schemas.openxmlformats.org/officeDocument/2006/customXml" ds:itemID="{71C8DDC1-8016-440D-BA63-9EEC32D34044}">
   <ds:schemaRefs>
     <ds:schemaRef ds:uri="http://schemas.openxmlformats.org/officeDocument/2006/bibliography"/>
   </ds:schemaRefs>

</xml_diff>

<commit_message>
Clarify two-student contributions and map responsibilities to files
</commit_message>
<xml_diff>
--- a/lab02_annotation/report.docx
+++ b/lab02_annotation/report.docx
@@ -296,7 +296,7 @@
       <w:r>
         <w:fldChar w:fldCharType="separate"/>
       </w:r>
-      <w:hyperlink w:anchor="_Toc239791217" w:history="1">
+      <w:hyperlink w:anchor="_Toc239880315" w:history="1">
         <w:r>
           <w:rPr>
             <w:rStyle w:val="aff8"/>
@@ -324,7 +324,7 @@
             <w:noProof/>
             <w:webHidden/>
           </w:rPr>
-          <w:instrText xml:space="preserve"> PAGEREF _Toc239791217 \h </w:instrText>
+          <w:instrText xml:space="preserve"> PAGEREF _Toc239880315 \h </w:instrText>
         </w:r>
         <w:r>
           <w:rPr>
@@ -369,7 +369,7 @@
           <w:lang w:val="ru-RU" w:eastAsia="ru-RU"/>
         </w:rPr>
       </w:pPr>
-      <w:hyperlink w:anchor="_Toc239791218" w:history="1">
+      <w:hyperlink w:anchor="_Toc239880316" w:history="1">
         <w:r>
           <w:rPr>
             <w:rStyle w:val="aff8"/>
@@ -397,7 +397,7 @@
             <w:noProof/>
             <w:webHidden/>
           </w:rPr>
-          <w:instrText xml:space="preserve"> PAGEREF _Toc239791218 \h </w:instrText>
+          <w:instrText xml:space="preserve"> PAGEREF _Toc239880316 \h </w:instrText>
         </w:r>
         <w:r>
           <w:rPr>
@@ -442,7 +442,7 @@
           <w:lang w:val="ru-RU" w:eastAsia="ru-RU"/>
         </w:rPr>
       </w:pPr>
-      <w:hyperlink w:anchor="_Toc239791219" w:history="1">
+      <w:hyperlink w:anchor="_Toc239880317" w:history="1">
         <w:r>
           <w:rPr>
             <w:rStyle w:val="aff8"/>
@@ -470,7 +470,7 @@
             <w:noProof/>
             <w:webHidden/>
           </w:rPr>
-          <w:instrText xml:space="preserve"> PAGEREF _Toc239791219 \h </w:instrText>
+          <w:instrText xml:space="preserve"> PAGEREF _Toc239880317 \h </w:instrText>
         </w:r>
         <w:r>
           <w:rPr>
@@ -515,7 +515,7 @@
           <w:lang w:val="ru-RU" w:eastAsia="ru-RU"/>
         </w:rPr>
       </w:pPr>
-      <w:hyperlink w:anchor="_Toc239791220" w:history="1">
+      <w:hyperlink w:anchor="_Toc239880318" w:history="1">
         <w:r>
           <w:rPr>
             <w:rStyle w:val="aff8"/>
@@ -543,7 +543,7 @@
             <w:noProof/>
             <w:webHidden/>
           </w:rPr>
-          <w:instrText xml:space="preserve"> PAGEREF _Toc239791220 \h </w:instrText>
+          <w:instrText xml:space="preserve"> PAGEREF _Toc239880318 \h </w:instrText>
         </w:r>
         <w:r>
           <w:rPr>
@@ -588,7 +588,7 @@
           <w:lang w:val="ru-RU" w:eastAsia="ru-RU"/>
         </w:rPr>
       </w:pPr>
-      <w:hyperlink w:anchor="_Toc239791221" w:history="1">
+      <w:hyperlink w:anchor="_Toc239880319" w:history="1">
         <w:r>
           <w:rPr>
             <w:rStyle w:val="aff8"/>
@@ -616,7 +616,7 @@
             <w:noProof/>
             <w:webHidden/>
           </w:rPr>
-          <w:instrText xml:space="preserve"> PAGEREF _Toc239791221 \h </w:instrText>
+          <w:instrText xml:space="preserve"> PAGEREF _Toc239880319 \h </w:instrText>
         </w:r>
         <w:r>
           <w:rPr>
@@ -661,7 +661,7 @@
           <w:lang w:val="ru-RU" w:eastAsia="ru-RU"/>
         </w:rPr>
       </w:pPr>
-      <w:hyperlink w:anchor="_Toc239791222" w:history="1">
+      <w:hyperlink w:anchor="_Toc239880320" w:history="1">
         <w:r>
           <w:rPr>
             <w:rStyle w:val="aff8"/>
@@ -689,7 +689,7 @@
             <w:noProof/>
             <w:webHidden/>
           </w:rPr>
-          <w:instrText xml:space="preserve"> PAGEREF _Toc239791222 \h </w:instrText>
+          <w:instrText xml:space="preserve"> PAGEREF _Toc239880320 \h </w:instrText>
         </w:r>
         <w:r>
           <w:rPr>
@@ -734,7 +734,7 @@
           <w:lang w:val="ru-RU" w:eastAsia="ru-RU"/>
         </w:rPr>
       </w:pPr>
-      <w:hyperlink w:anchor="_Toc239791223" w:history="1">
+      <w:hyperlink w:anchor="_Toc239880321" w:history="1">
         <w:r>
           <w:rPr>
             <w:rStyle w:val="aff8"/>
@@ -762,7 +762,7 @@
             <w:noProof/>
             <w:webHidden/>
           </w:rPr>
-          <w:instrText xml:space="preserve"> PAGEREF _Toc239791223 \h </w:instrText>
+          <w:instrText xml:space="preserve"> PAGEREF _Toc239880321 \h </w:instrText>
         </w:r>
         <w:r>
           <w:rPr>
@@ -807,7 +807,7 @@
           <w:lang w:val="ru-RU" w:eastAsia="ru-RU"/>
         </w:rPr>
       </w:pPr>
-      <w:hyperlink w:anchor="_Toc239791224" w:history="1">
+      <w:hyperlink w:anchor="_Toc239880322" w:history="1">
         <w:r>
           <w:rPr>
             <w:rStyle w:val="aff8"/>
@@ -835,7 +835,7 @@
             <w:noProof/>
             <w:webHidden/>
           </w:rPr>
-          <w:instrText xml:space="preserve"> PAGEREF _Toc239791224 \h </w:instrText>
+          <w:instrText xml:space="preserve"> PAGEREF _Toc239880322 \h </w:instrText>
         </w:r>
         <w:r>
           <w:rPr>
@@ -880,7 +880,7 @@
           <w:lang w:val="ru-RU" w:eastAsia="ru-RU"/>
         </w:rPr>
       </w:pPr>
-      <w:hyperlink w:anchor="_Toc239791225" w:history="1">
+      <w:hyperlink w:anchor="_Toc239880323" w:history="1">
         <w:r>
           <w:rPr>
             <w:rStyle w:val="aff8"/>
@@ -908,7 +908,7 @@
             <w:noProof/>
             <w:webHidden/>
           </w:rPr>
-          <w:instrText xml:space="preserve"> PAGEREF _Toc239791225 \h </w:instrText>
+          <w:instrText xml:space="preserve"> PAGEREF _Toc239880323 \h </w:instrText>
         </w:r>
         <w:r>
           <w:rPr>
@@ -956,7 +956,7 @@
         <w:ind w:firstLine="0"/>
         <w:jc w:val="center"/>
       </w:pPr>
-      <w:bookmarkStart w:id="1" w:name="_Toc239791217"/>
+      <w:bookmarkStart w:id="1" w:name="_Toc239880315"/>
       <w:r>
         <w:lastRenderedPageBreak/>
         <w:t>ВВЕДЕНИЕ</w:t>
@@ -993,7 +993,7 @@
         <w:spacing w:after="240"/>
         <w:jc w:val="left"/>
       </w:pPr>
-      <w:bookmarkStart w:id="2" w:name="_Toc239791218"/>
+      <w:bookmarkStart w:id="2" w:name="_Toc239880316"/>
       <w:r>
         <w:lastRenderedPageBreak/>
         <w:t>1 Выполнение работы</w:t>
@@ -1007,7 +1007,7 @@
         <w:spacing w:before="240" w:after="240"/>
         <w:jc w:val="left"/>
       </w:pPr>
-      <w:bookmarkStart w:id="3" w:name="_Toc239791219"/>
+      <w:bookmarkStart w:id="3" w:name="_Toc239880317"/>
       <w:r>
         <w:t>1.1 Первичная разметка</w:t>
       </w:r>
@@ -1532,7 +1532,7 @@
         <w:spacing w:before="240" w:after="240"/>
         <w:jc w:val="left"/>
       </w:pPr>
-      <w:bookmarkStart w:id="4" w:name="_Toc239791220"/>
+      <w:bookmarkStart w:id="4" w:name="_Toc239880318"/>
       <w:r>
         <w:t>1.2 Выбор разногласий и общая инструкция</w:t>
       </w:r>
@@ -1582,7 +1582,7 @@
         <w:spacing w:before="240" w:after="240"/>
         <w:jc w:val="left"/>
       </w:pPr>
-      <w:bookmarkStart w:id="5" w:name="_Toc239791221"/>
+      <w:bookmarkStart w:id="5" w:name="_Toc239880319"/>
       <w:r>
         <w:t>1.3 Три спорных примера</w:t>
       </w:r>
@@ -1590,7 +1590,7 @@
     </w:p>
     <w:p>
       <w:r>
-        <w:t xml:space="preserve">T26: «Мне срочно нужен совет по выбору обоев». Первично A поставил ?, B и C — 1. Для A отсутствовала причина немедленного решения, другие участники </w:t>
+        <w:t xml:space="preserve">T26: «Мне срочно нужен совет по выбору обоев». Первично A поставил ?, B и C — 1. Для A отсутствовала причина немедленного решения, разметчики B и C </w:t>
       </w:r>
       <w:r>
         <w:t>учитывали прямой маркер. После инструкции все поставили 1: размечается выраженное требование, а не доказанная важность ремонта. Этот конфликт устраняется выбором операционального определения, а не обнаружением скрытого объективного ответа.</w:t>
@@ -1626,7 +1626,7 @@
         <w:spacing w:before="240" w:after="240"/>
         <w:jc w:val="left"/>
       </w:pPr>
-      <w:bookmarkStart w:id="6" w:name="_Toc239791222"/>
+      <w:bookmarkStart w:id="6" w:name="_Toc239880320"/>
       <w:r>
         <w:t>1.4 Повторный этап и ограничения</w:t>
       </w:r>
@@ -1658,7 +1658,7 @@
         <w:spacing w:before="240" w:after="240"/>
         <w:jc w:val="left"/>
       </w:pPr>
-      <w:bookmarkStart w:id="7" w:name="_Toc239791223"/>
+      <w:bookmarkStart w:id="7" w:name="_Toc239880321"/>
       <w:r>
         <w:lastRenderedPageBreak/>
         <w:t>1.5 Вклад участников</w:t>
@@ -1704,7 +1704,7 @@
         <w:ind w:firstLine="0"/>
         <w:jc w:val="center"/>
       </w:pPr>
-      <w:bookmarkStart w:id="8" w:name="_Toc239791224"/>
+      <w:bookmarkStart w:id="8" w:name="_Toc239880322"/>
       <w:r>
         <w:lastRenderedPageBreak/>
         <w:t>ЗАКЛЮЧЕНИЕ</w:t>
@@ -1731,7 +1731,7 @@
         <w:ind w:firstLine="0"/>
         <w:jc w:val="center"/>
       </w:pPr>
-      <w:bookmarkStart w:id="9" w:name="_Toc239791225"/>
+      <w:bookmarkStart w:id="9" w:name="_Toc239880323"/>
       <w:r>
         <w:lastRenderedPageBreak/>
         <w:t>СПИСОК ИСПОЛЬЗОВАННЫХ ИСТОЧНИКОВ</w:t>
@@ -13808,7 +13808,7 @@
 </file>
 
 <file path=customXml/itemProps1.xml><?xml version="1.0" encoding="utf-8"?>
-<ds:datastoreItem xmlns:ds="http://schemas.openxmlformats.org/officeDocument/2006/customXml" ds:itemID="{71C8DDC1-8016-440D-BA63-9EEC32D34044}">
+<ds:datastoreItem xmlns:ds="http://schemas.openxmlformats.org/officeDocument/2006/customXml" ds:itemID="{586A6F17-172B-4462-BE0A-17882F30F95D}">
   <ds:schemaRefs>
     <ds:schemaRef ds:uri="http://schemas.openxmlformats.org/officeDocument/2006/bibliography"/>
   </ds:schemaRefs>

</xml_diff>